<commit_message>
3.06 says 'Lessons 6–7', like the other two-lesson periods
The 3.06 spec gave lesson_no="6–7", so every 3.06 document read 'Lesson 6–7' (title slide
'LESSON 6–7') where 4.02 and 4.07 read 'Lessons 2–3' and 'Lessons 7–8'. The spec now uses
label="Lessons 6–7", the Unit 4 form. Unit 3 rebuilt whole (build_all u3 --install): every
check 0 findings. Only the 3.06 documents changed in content — 27 files, each differing from
the last commit by the label wording alone (135 occurrences), verified text-for-text; the other
258 rebuilt files were timestamp-only and are left as they were.

Co-Authored-By: Claude Opus 5 <noreply@anthropic.com>
Claude-Session: https://claude.ai/code/session_015xYWeLUsuszQH6z7ADE9tj
</commit_message>
<xml_diff>
--- a/a7/build/out/u3/A7 3.06  Lesson Plan.docx
+++ b/a7/build/out/u3/A7 3.06  Lesson Plan.docx
@@ -42,7 +42,7 @@
                 <w:color w:val="6B6B6B"/>
                 <w:sz w:val="17"/>
               </w:rPr>
-              <w:t>Grade 7 Accelerated  ·  Unit 3  ·  Lesson 6–7</w:t>
+              <w:t>Grade 7 Accelerated  ·  Unit 3  ·  Lessons 6–7</w:t>
             </w:r>
           </w:p>
           <w:p>
@@ -356,7 +356,7 @@
                 <w:color w:val="1A1A1A"/>
                 <w:sz w:val="20"/>
               </w:rPr>
-              <w:t>Lesson 6–7 — Evaluating and Equivalent Expressions</w:t>
+              <w:t>Lessons 6–7 — Evaluating and Equivalent Expressions</w:t>
             </w:r>
           </w:p>
         </w:tc>

</xml_diff>